<commit_message>
Enhance evaluation and injection scripts; add tests for processor behavior
- Updated `evaluate.py` to restrict contamination argument to predefined choices.
- Modified `inject.py` to handle undelivered Kafka messages and exit with an error message if not all edits are delivered.
- Improved `processor.py` to reset last seen timestamps after a period of inactivity.
- Added a test in `test_scripts.py` to ensure invalid contamination values are rejected.
- Enhanced `test_sse.py` to handle different HTTP error responses and reset refusal counts.
- Introduced `test_processor.py` to validate that partitions are not idled by the first batch after a stream-wide silence.
- Removed unnecessary pandas dependency from `uv.lock`.
</commit_message>
<xml_diff>
--- a/report/WikiRadar_Report.docx
+++ b/report/WikiRadar_Report.docx
@@ -379,7 +379,7 @@
         <w:jc w:val="both"/>
       </w:pPr>
       <w:r>
-        <w:t xml:space="preserve">On a held-out day with 100 synthetic attacks mixed in, the system flags 87% of attacks at intensity 3 to 5 at a cost of 17.3 false alarms per hour, most of them in five hours when the normal mix of bot and human traffic shifted. Live, an injected attack appears on the dashboard within 7 to 21 seconds, and the pipeline ran for 2 hours unattended with flat memory and no lost or double-counted edits.</w:t>
+        <w:t xml:space="preserve">On a held-out day with 100 synthetic attacks mixed in, the system flags 87% of attacks at intensity 3 to 5 at a cost of 17.3 false alarms per hour, most of them in five hours when the normal mix of bot and human traffic shifted. Live, an injected attack appears on the dashboard within 7 to 23 seconds, and the pipeline ran for 2 hours unattended with flat memory and no lost or double-counted edits.</w:t>
       </w:r>
     </w:p>
     <w:p>
@@ -2139,7 +2139,7 @@
         <w:jc w:val="both"/>
       </w:pPr>
       <w:r>
-        <w:t xml:space="preserve">Both files cover the full 24 hours with no duplicates and no gap longer than 11 seconds. A window holds about 26 edits on average. Traffic follows a strong daily cycle: on the training day it ranged from 4,643 to 13,226 edits per hour, and the bot share ranged from 7% to 53% by hour. About 6% of edits come from anonymous users.</w:t>
+        <w:t xml:space="preserve">Both files cover the full 24 hours with no duplicates and no gap longer than about 11 seconds. A window holds about 26 edits on average. Traffic follows a strong daily cycle: on the training day it ranged from 4,643 to 13,226 edits per hour, and the bot share ranged from 7% to 53% by hour. About 6% of edits come from anonymous users.</w:t>
       </w:r>
     </w:p>
     <w:p>
@@ -2757,7 +2757,7 @@
         <w:t xml:space="preserve">watermark</w:t>
       </w:r>
       <w:r>
-        <w:t xml:space="preserve"> decides: it is the latest event time seen minus 5 seconds, and once a window's end is behind it the window is closed, scored and written. An edit that arrives after its window has closed is counted as late and not added. In normal running no edits were late.</w:t>
+        <w:t xml:space="preserve"> decides: it is the latest event time seen minus 5 seconds (tracked per partition, as explained below), and once a window's end is behind it the window is closed, scored and written. An edit that arrives after its window has closed is counted as late and not added. In normal running no edits were late.</w:t>
       </w:r>
     </w:p>
     <w:p>
@@ -2765,7 +2765,7 @@
         <w:jc w:val="both"/>
       </w:pPr>
       <w:r>
-        <w:t xml:space="preserve">The first version used one watermark for the whole stream. A restart test showed that Kafka delivered one partition's backlog first, which pushed the watermark forward and caused 43 edits from the other partitions to be dropped as late. The fix, which Flink and Kafka Streams also use, is a watermark per partition: a window closes only when the slowest partition has moved past it.</w:t>
+        <w:t xml:space="preserve">The first version used one watermark for the whole stream. A restart test showed that Kafka delivered one partition's backlog first, which pushed the watermark forward and caused 43 edits from the other partitions to be dropped as late. The fix, the same idea as Flink's per-partition watermarks, is a watermark per partition: a window closes only when the slowest partition has moved past it.</w:t>
       </w:r>
     </w:p>
     <w:p>
@@ -3887,7 +3887,7 @@
         <w:t xml:space="preserve">contamination</w:t>
       </w:r>
       <w:r>
-        <w:t xml:space="preserve">, the share of training windows the model treats as anomalous, which sets the threshold. The default of 0.01 caught too few attacks, so 0.02 was chosen after the sweep in Section 11.2. The hour features let the model learn the daily cycle, so the quiet early morning is not flagged every day; sine and cosine make 23:00 and 00:00 neighbours.</w:t>
+        <w:t xml:space="preserve">, the share of training windows the model treats as anomalous, which sets the threshold. The initial value of 0.01 caught too few attacks, so 0.02 was chosen after the sweep in Section 11.2. It is a direct trade-off: a lower value raises fewer false alarms but misses weaker attacks, and a higher value catches more attacks at the cost of more false alarms. The hour features let the model learn the daily cycle, so the quiet early morning is not flagged every day; sine and cosine make 23:00 and 00:00 neighbours.</w:t>
       </w:r>
     </w:p>
     <w:p>
@@ -4030,7 +4030,7 @@
           <w:sz w:val="18"/>
           <w:szCs w:val="18"/>
         </w:rPr>
-        <w:t xml:space="preserve">def score(artifact, x):</w:t>
+        <w:t xml:space="preserve">def score(artifact: dict, x: np.ndarray) -&gt; tuple[float, bool, str]:</w:t>
       </w:r>
     </w:p>
     <w:p>
@@ -4044,7 +4044,7 @@
           <w:sz w:val="18"/>
           <w:szCs w:val="18"/>
         </w:rPr>
-        <w:t xml:space="preserve">    s = float(-artifact["model"].decision_function(x.reshape(1, -1))[0])</w:t>
+        <w:t xml:space="preserve">    s = float(scores(artifact, x.reshape(1, -1))[0])</w:t>
       </w:r>
     </w:p>
     <w:p>
@@ -4608,7 +4608,7 @@
         <w:jc w:val="both"/>
       </w:pPr>
       <w:r>
-        <w:t xml:space="preserve">Train the model once so the model file exists: </w:t>
+        <w:t xml:space="preserve">The trained model (models/iforest.joblib) is included in the repository, so no training step is needed. To retrain: </w:t>
       </w:r>
       <w:r>
         <w:rPr>
@@ -4815,7 +4815,7 @@
         <w:t xml:space="preserve">uv run scripts/inject.py --attack vandal_wave --intensity 3</w:t>
       </w:r>
       <w:r>
-        <w:t xml:space="preserve">. Within about 20 seconds a red marker appears and the anomalies table shows </w:t>
+        <w:t xml:space="preserve">. Typically within 20 seconds (at most about 25) a red marker appears and the anomalies table shows </w:t>
       </w:r>
       <w:r>
         <w:rPr>
@@ -5440,7 +5440,7 @@
         <w:jc w:val="both"/>
       </w:pPr>
       <w:r>
-        <w:t xml:space="preserve">Each attack is placed inside one 10-second window and counts as detected if that window is flagged. The "beyond chance" figure counts only windows that the attack itself pushed over the threshold.</w:t>
+        <w:t xml:space="preserve">Intensity scales each attack from 1 to 5: it multiplies the number of edits, and for page_blank also the size of each removal. Each attack is placed inside one 10-second window and counts as detected if that window is flagged. The "beyond chance" figure counts only windows that the attack itself pushed over the threshold.</w:t>
       </w:r>
     </w:p>
     <w:p>
@@ -6158,7 +6158,7 @@
         <w:jc w:val="both"/>
       </w:pPr>
       <w:r>
-        <w:t xml:space="preserve">The target was 70% detection at intensity 3 and above. The default contamination of 0.01 reached only 60%, so 0.02 was chosen: it doubles the false alarms but clears the target even when chance detections are removed. The value was chosen on the same holdout attacks it is measured on, so 87% is somewhat optimistic.</w:t>
+        <w:t xml:space="preserve">The target was 70% detection at intensity 3 and above. The initial contamination of 0.01 reached only 60%, so 0.02 was chosen: it doubles the false alarms but clears the target even when chance detections are removed. The value was chosen on the same holdout attacks it is measured on, so 87% is somewhat optimistic.</w:t>
       </w:r>
     </w:p>
     <w:p>
@@ -7050,7 +7050,7 @@
               <w:spacing w:after="0" w:line="240"/>
             </w:pPr>
             <w:r>
-              <w:t xml:space="preserve">16 to 21 s when the attack starts at the beginning of a window; 7 to 10 s when it lands later in a window</w:t>
+              <w:t xml:space="preserve">16 to 23 s when the attack starts at the beginning of a window; 7 to 10 s when it lands later in a window</w:t>
             </w:r>
           </w:p>
         </w:tc>
@@ -7298,7 +7298,7 @@
         <w:jc w:val="both"/>
       </w:pPr>
       <w:r>
-        <w:t xml:space="preserve">A pytest suite covers event parsing (anonymous and temporary accounts, revert detection, missing fields), window alignment, the watermark and late events, out-of-order events, feature values for a hand-built window, the attack generators and the model's feature-name check.</w:t>
+        <w:t xml:space="preserve">A pytest suite covers event parsing (anonymous and temporary accounts, revert detection, missing fields), window alignment, the watermark and late events, out-of-order events, feature values for a hand-built window, the attack generators and the model's scoring and reason text.</w:t>
       </w:r>
     </w:p>
     <w:p>
@@ -7389,7 +7389,7 @@
         <w:t xml:space="preserve">No labels.</w:t>
       </w:r>
       <w:r>
-        <w:t xml:space="preserve"> Detection was measured only on synthetic attacks designed for this project; real vandalism is messier.</w:t>
+        <w:t xml:space="preserve"> Detection was measured only on synthetic attacks designed for this project; real vandalism is messier. Synthetic attacks are a proxy: the detection rates say how well the model separates these five patterns from normal traffic, not how many real incidents it would catch.</w:t>
       </w:r>
     </w:p>
     <w:p>
@@ -7493,7 +7493,7 @@
         <w:jc w:val="both"/>
       </w:pPr>
       <w:r>
-        <w:t xml:space="preserve">WikiRadar is a complete streaming pipeline from a public live source to a self-updating dashboard. Kafka buffers and replays the feed, the processor windows edits by event time using a per-partition watermark, an IsolationForest trained on a day of real traffic scores every window, and PostgreSQL and Grafana present the results within about 15 to 20 seconds.</w:t>
+        <w:t xml:space="preserve">WikiRadar is a complete streaming pipeline from a public live source to a self-updating dashboard. Kafka buffers and replays the feed, the processor windows edits by event time using a per-partition watermark, an IsolationForest trained on a day of real traffic scores every window, and PostgreSQL and Grafana present the results typically within 15 to 20 seconds.</w:t>
       </w:r>
     </w:p>
     <w:p>

</xml_diff>